<commit_message>
Manuscript: real-array evaluation on DREGON (Section 7.6, Table 10, Fig. 11)
- experiments/dregon_tables.py builds the table and figure from the
  per-segment results recorded on the author's machine
- abstract, contributions, limitations, validation plan, conclusions,
  data statement, cover letter and highlights updated: broadband source
  within 10 deg in 182/217 in-flight segments with noise cross-spectra
  subtraction; in-flight speech not localized

Co-Authored-By: Claude Opus 5.5 <noreply@anthropic.com>
Claude-Session: https://claude.ai/code/session_01Tjp7tKuW9QND1aAEqAWhGA
</commit_message>
<xml_diff>
--- a/docs/submission_applied_acoustics/AA_Cover_Letter.docx
+++ b/docs/submission_applied_acoustics/AA_Cover_Letter.docx
@@ -173,7 +173,7 @@
         <w:jc w:val="both"/>
       </w:pPr>
       <w:r>
-        <w:t xml:space="preserve">The evaluation is deliberately conservative: all estimates carry 95% confidence intervals, and the drone-signature classifier is tested without data leakage, which on real drone recordings lowers its accuracy from 96% (random split) to 72% when training and test clips come from different recording campaigns. The manuscript states plainly that the array signals are simulated and that real-array and hardware validation is in preparation; the planned tests and the tools to run them are released with the paper.</w:t>
+        <w:t xml:space="preserve">The evaluation is deliberately conservative: all estimates carry 95% confidence intervals, and the drone-signature classifier is tested without data leakage, which on real drone recordings lowers its accuracy from 96% (random split) to 72% when training and test clips come from different recording campaigns. The estimator was also evaluated, without tuning, on the real in-flight recordings of the DREGON dataset: with noise cross-spectra subtraction it located a broadband loudspeaker within 10° in 182 of 217 segments (median 3.4°) at signal-to-noise ratios near −12 dB, whereas in-flight speech was not localized; both outcomes are reported. The manuscript states plainly which results are simulated and that validation of the spherical sensor itself is in preparation; the planned tests and the tools to run them are released with the paper.</w:t>
       </w:r>
     </w:p>
     <w:p>
@@ -203,7 +203,7 @@
       <w:r>
         <w:t xml:space="preserve">All source code, data download scripts and the scripts that regenerate every table and figure are openly available under the MIT license (</w:t>
       </w:r>
-      <w:hyperlink w:history="1" r:id="rIdvyvewthgb7g1e-jfopzm4">
+      <w:hyperlink w:history="1" r:id="rIdnr7zy4i78s5m1ttqxh9km">
         <w:r>
           <w:rPr>
             <w:rStyle w:val="Hyperlink"/>
@@ -214,7 +214,7 @@
       <w:r>
         <w:t xml:space="preserve">; archived at </w:t>
       </w:r>
-      <w:hyperlink w:history="1" r:id="rIdchtaf6lbpsgw1exwgkvww">
+      <w:hyperlink w:history="1" r:id="rIdpykzt-yxa0rhgqwnn-kmp">
         <w:r>
           <w:rPr>
             <w:rStyle w:val="Hyperlink"/>

</xml_diff>

<commit_message>
Use institutional corresponding e-mail (hsaied@psmchs.edu.sa)
Co-Authored-By: Claude Opus 5.5 <noreply@anthropic.com>
Claude-Session: https://claude.ai/code/session_01Tjp7tKuW9QND1aAEqAWhGA
</commit_message>
<xml_diff>
--- a/docs/submission_applied_acoustics/AA_Cover_Letter.docx
+++ b/docs/submission_applied_acoustics/AA_Cover_Letter.docx
@@ -21,7 +21,7 @@
         <w:spacing w:after="240"/>
       </w:pPr>
       <w:r>
-        <w:t xml:space="preserve">E-mail: hushamfarouk@gmail.com</w:t>
+        <w:t xml:space="preserve">E-mail: hsaied@psmchs.edu.sa</w:t>
       </w:r>
     </w:p>
     <w:p>
@@ -212,7 +212,7 @@
       <w:r>
         <w:t xml:space="preserve">All source code, data download scripts and the scripts that regenerate every table and figure are openly available under the MIT license (</w:t>
       </w:r>
-      <w:hyperlink w:history="1" r:id="rIdew2cemwvqvbh0fa_7xw_r">
+      <w:hyperlink w:history="1" r:id="rIdgnixk2lxl7m4-o-tmdvqb">
         <w:r>
           <w:rPr>
             <w:rStyle w:val="Hyperlink"/>
@@ -223,7 +223,7 @@
       <w:r>
         <w:t xml:space="preserve">; archived at </w:t>
       </w:r>
-      <w:hyperlink w:history="1" r:id="rId8qcnxpsec23bxtvr5yhrd">
+      <w:hyperlink w:history="1" r:id="rIdhsm8i3ilsi22xl93ys42p">
         <w:r>
           <w:rPr>
             <w:rStyle w:val="Hyperlink"/>

</xml_diff>

<commit_message>
Cover letter: name suggested reviewers (the submission form has no reviewer field)
Co-Authored-By: Claude Opus 5.5 <noreply@anthropic.com>
Claude-Session: https://claude.ai/code/session_01Tjp7tKuW9QND1aAEqAWhGA
</commit_message>
<xml_diff>
--- a/docs/submission_applied_acoustics/AA_Cover_Letter.docx
+++ b/docs/submission_applied_acoustics/AA_Cover_Letter.docx
@@ -212,7 +212,7 @@
       <w:r>
         <w:t xml:space="preserve">All source code, data download scripts and the scripts that regenerate every table and figure are openly available under the MIT license (</w:t>
       </w:r>
-      <w:hyperlink w:history="1" r:id="rIdfeuhqvd8m10a4i5eopyb4">
+      <w:hyperlink w:history="1" r:id="rIdxxhjobl4rpoicjjknhtuc">
         <w:r>
           <w:rPr>
             <w:rStyle w:val="Hyperlink"/>
@@ -223,7 +223,7 @@
       <w:r>
         <w:t xml:space="preserve">; archived at </w:t>
       </w:r>
-      <w:hyperlink w:history="1" r:id="rId0fkbjxjcljj9ivwiydwa_">
+      <w:hyperlink w:history="1" r:id="rIdftbrm1rtqr4ynr-jjhc2l">
         <w:r>
           <w:rPr>
             <w:rStyle w:val="Hyperlink"/>
@@ -241,7 +241,7 @@
         <w:jc w:val="both"/>
       </w:pPr>
       <w:r>
-        <w:t xml:space="preserve">I confirm that this manuscript is original, has not been published previously, and is not under consideration for publication elsewhere. There are no competing interests to declare, and no specific funding was received. As stated in the manuscript, an AI assistant was used to help implement the simulation software and to draft and edit the text; the author has reviewed all content and takes full responsibility for it. A list of suggested reviewers is provided with the submission.</w:t>
+        <w:t xml:space="preserve">I confirm that this manuscript is original, has not been published previously, and is not under consideration for publication elsewhere. There are no competing interests to declare, and no specific funding was received. As stated in the manuscript, an AI assistant was used to help implement the simulation software and to draft and edit the text; the author has reviewed all content and takes full responsibility for it. Possible reviewers with relevant expertise and no known conflict of interest are Dr. Antoine Deleforge (Inria, France), Dr. Lin Wang (Queen Mary University of London, UK), Assoc. Prof. Yusuke Hioka (University of Auckland, New Zealand), Prof. Kazuhiro Nakadai (Institute of Science Tokyo, Japan) and Dr. Fernando Alonso-Fernandez (Halmstad University, Sweden).</w:t>
       </w:r>
     </w:p>
     <w:p>

</xml_diff>